<commit_message>
Add Martabe WIs batch 13 (TPS cube pH meter)
Co-Authored-By: Claude Sonnet 5.5 <noreply@anthropic.com>
Claude-Session: https://claude.ai/code/session_0121qocWgsZdFAsne2oz9sHT
</commit_message>
<xml_diff>
--- a/SWI/206-Met-Lab-Operations-and-Safety/MM-4034-033-OR-03-SWI-PRO-MET-206-004-pH-DO-and-Conductivity-Meter-Calibration-RevA.docx
+++ b/SWI/206-Met-Lab-Operations-and-Safety/MM-4034-033-OR-03-SWI-PRO-MET-206-004-pH-DO-and-Conductivity-Meter-Calibration-RevA.docx
@@ -638,7 +638,7 @@
                 <w:sz w:val="17"/>
                 <w:szCs w:val="17"/>
               </w:rPr>
-              <w:t xml:space="preserve">DRAFT FOR REVIEW. Martabe work instruction 'Operate DO Meter Portable' (DOC-3-MET-PRS-WIN-00055-IE, v1.0, issued 25/12/2024) added as Section 6 Part B. It is written for the Oxyguard Handy Polaris meter. Not approved until reviewed. JSEA JSEA-PRO-MET-206-004 must be checked.</w:t>
+              <w:t xml:space="preserve">DRAFT FOR REVIEW. Martabe work instructions 'Operate DO Meter Portable' (DOC-3-MET-PRS-WIN-00055-IE, issued 25/12/2024) as Part B and 'Operating pH Cube Meter' (TPS cube, DOC-3-MET-PMC-WIN-00089-IE) as Part C added to Section 6. Part B is written for the Oxyguard Handy Polaris meter and Part C for the TPS pH cube meter. Not approved until reviewed. JSEA JSEA-PRO-MET-206-004 must be checked.</w:t>
             </w:r>
           </w:p>
         </w:tc>
@@ -1374,6 +1374,58 @@
           </w:p>
         </w:tc>
       </w:tr>
+      <w:tr>
+        <w:tc>
+          <w:tcPr>
+            <w:tcW w:type="dxa" w:w="2900"/>
+            <w:shd w:val="clear" w:color="auto" w:fill="F2F5FA"/>
+            <w:tcMar>
+              <w:top w:type="dxa" w:w="55"/>
+              <w:left w:type="dxa" w:w="85"/>
+              <w:bottom w:type="dxa" w:w="55"/>
+              <w:right w:type="dxa" w:w="85"/>
+            </w:tcMar>
+          </w:tcPr>
+          <w:p>
+            <w:pPr>
+              <w:spacing w:after="0" w:line="235"/>
+            </w:pPr>
+            <w:r>
+              <w:rPr>
+                <w:rFonts w:ascii="Calibri" w:cs="Calibri" w:eastAsia="Calibri" w:hAnsi="Calibri"/>
+                <w:sz w:val="16"/>
+                <w:szCs w:val="16"/>
+              </w:rPr>
+              <w:t xml:space="preserve">[JSEA to confirm] Contact with the sample and splash to the eyes at the pH meter</w:t>
+            </w:r>
+          </w:p>
+        </w:tc>
+        <w:tc>
+          <w:tcPr>
+            <w:tcW w:type="dxa" w:w="6126"/>
+            <w:shd w:val="clear" w:color="auto" w:fill="F2F5FA"/>
+            <w:tcMar>
+              <w:top w:type="dxa" w:w="55"/>
+              <w:left w:type="dxa" w:w="85"/>
+              <w:bottom w:type="dxa" w:w="55"/>
+              <w:right w:type="dxa" w:w="85"/>
+            </w:tcMar>
+          </w:tcPr>
+          <w:p>
+            <w:pPr>
+              <w:spacing w:after="0" w:line="235"/>
+            </w:pPr>
+            <w:r>
+              <w:rPr>
+                <w:rFonts w:ascii="Calibri" w:cs="Calibri" w:eastAsia="Calibri" w:hAnsi="Calibri"/>
+                <w:sz w:val="16"/>
+                <w:szCs w:val="16"/>
+              </w:rPr>
+              <w:t xml:space="preserve">Latex gloves, glasses and safety boots. Eyewash proven flowing; flush the eyes and skin under running water at once.</w:t>
+            </w:r>
+          </w:p>
+        </w:tc>
+      </w:tr>
     </w:tbl>
     <w:p>
       <w:pPr>
@@ -1925,6 +1977,24 @@
     </w:p>
     <w:p>
       <w:pPr>
+        <w:pStyle w:val="ListParagraph"/>
+        <w:numPr>
+          <w:ilvl w:val="0"/>
+          <w:numId w:val="1"/>
+        </w:numPr>
+        <w:spacing w:after="60" w:line="245"/>
+      </w:pPr>
+      <w:r>
+        <w:rPr>
+          <w:rFonts w:ascii="Calibri" w:cs="Calibri" w:eastAsia="Calibri" w:hAnsi="Calibri"/>
+          <w:sz w:val="17"/>
+          <w:szCs w:val="17"/>
+        </w:rPr>
+        <w:t xml:space="preserve">[M] TPS pH cube meter with pH and temperature sensors, small bucket, buffer solutions</w:t>
+      </w:r>
+    </w:p>
+    <w:p>
+      <w:pPr>
         <w:pStyle w:val="Heading1"/>
         <w:spacing w:after="120" w:before="260"/>
       </w:pPr>
@@ -2362,6 +2432,193 @@
     </w:p>
     <w:p>
       <w:pPr>
+        <w:spacing w:after="90" w:before="180" w:line="245"/>
+        <w:keepNext/>
+      </w:pPr>
+      <w:r>
+        <w:rPr>
+          <w:rFonts w:ascii="Calibri" w:cs="Calibri" w:eastAsia="Calibri" w:hAnsi="Calibri"/>
+          <w:b/>
+          <w:bCs/>
+          <w:color w:val="1F3864"/>
+          <w:sz w:val="19"/>
+          <w:szCs w:val="19"/>
+        </w:rPr>
+        <w:t xml:space="preserve">Part C - Operating the TPS pH cube meter [M]</w:t>
+      </w:r>
+    </w:p>
+    <w:p>
+      <w:pPr>
+        <w:spacing w:after="60" w:before="0" w:line="245"/>
+      </w:pPr>
+      <w:r>
+        <w:rPr>
+          <w:rFonts w:ascii="Calibri" w:cs="Calibri" w:eastAsia="Calibri" w:hAnsi="Calibri"/>
+          <w:sz w:val="17"/>
+          <w:szCs w:val="17"/>
+        </w:rPr>
+        <w:t xml:space="preserve">[M] = taken from the Martabe team work instruction "Operating pH Cube Meter (DOC-3-MET-PMC-WIN-00089-IE)" (25/12/2024). [CONFIRM] = unspecified or inconsistent in the source; resolve before this instruction is approved for use. Parts A and B are unchanged.</w:t>
+      </w:r>
+    </w:p>
+    <w:p>
+      <w:pPr>
+        <w:spacing w:after="60" w:before="0" w:line="245"/>
+      </w:pPr>
+      <w:r>
+        <w:rPr>
+          <w:rFonts w:ascii="Calibri" w:cs="Calibri" w:eastAsia="Calibri" w:hAnsi="Calibri"/>
+          <w:sz w:val="17"/>
+          <w:szCs w:val="17"/>
+        </w:rPr>
+        <w:t xml:space="preserve">[CONFIRM] the TPS cube meter is not in Section 5, which lists the pH/ORP meters in the ILS quotation. Confirm the meter is on site. Its calibration is the Martabe 'WI Kalibrasi pH TPS cube', which has not been received; the same instruction is the calibration step quoted in SWI-PRO-MET-201-013 Part D.</w:t>
+      </w:r>
+    </w:p>
+    <w:p>
+      <w:pPr>
+        <w:ind w:left="280"/>
+        <w:spacing w:after="50" w:before="0" w:line="245"/>
+      </w:pPr>
+      <w:r>
+        <w:rPr>
+          <w:rFonts w:ascii="Calibri" w:cs="Calibri" w:eastAsia="Calibri" w:hAnsi="Calibri"/>
+          <w:b/>
+          <w:bCs/>
+          <w:sz w:val="17"/>
+          <w:szCs w:val="17"/>
+        </w:rPr>
+        <w:t xml:space="preserve">16.</w:t>
+      </w:r>
+      <w:r>
+        <w:rPr>
+          <w:rFonts w:ascii="Calibri" w:cs="Calibri" w:eastAsia="Calibri" w:hAnsi="Calibri"/>
+          <w:sz w:val="17"/>
+          <w:szCs w:val="17"/>
+        </w:rPr>
+        <w:t xml:space="preserve">  Take 5 and prepare the pH meter and a small bucket, the sample and the buffer solutions. Check the equipment is in good condition and the buffer solutions are in date [M].</w:t>
+      </w:r>
+    </w:p>
+    <w:p>
+      <w:pPr>
+        <w:ind w:left="280"/>
+        <w:spacing w:after="50" w:before="0" w:line="245"/>
+      </w:pPr>
+      <w:r>
+        <w:rPr>
+          <w:rFonts w:ascii="Calibri" w:cs="Calibri" w:eastAsia="Calibri" w:hAnsi="Calibri"/>
+          <w:b/>
+          <w:bCs/>
+          <w:sz w:val="17"/>
+          <w:szCs w:val="17"/>
+        </w:rPr>
+        <w:t xml:space="preserve">17.</w:t>
+      </w:r>
+      <w:r>
+        <w:rPr>
+          <w:rFonts w:ascii="Calibri" w:cs="Calibri" w:eastAsia="Calibri" w:hAnsi="Calibri"/>
+          <w:sz w:val="17"/>
+          <w:szCs w:val="17"/>
+        </w:rPr>
+        <w:t xml:space="preserve">  Calibrate the meter first (Martabe TPS cube calibration instruction, not received).</w:t>
+      </w:r>
+    </w:p>
+    <w:p>
+      <w:pPr>
+        <w:ind w:left="280"/>
+        <w:spacing w:after="50" w:before="0" w:line="245"/>
+      </w:pPr>
+      <w:r>
+        <w:rPr>
+          <w:rFonts w:ascii="Calibri" w:cs="Calibri" w:eastAsia="Calibri" w:hAnsi="Calibri"/>
+          <w:b/>
+          <w:bCs/>
+          <w:sz w:val="17"/>
+          <w:szCs w:val="17"/>
+        </w:rPr>
+        <w:t xml:space="preserve">18.</w:t>
+      </w:r>
+      <w:r>
+        <w:rPr>
+          <w:rFonts w:ascii="Calibri" w:cs="Calibri" w:eastAsia="Calibri" w:hAnsi="Calibri"/>
+          <w:sz w:val="17"/>
+          <w:szCs w:val="17"/>
+        </w:rPr>
+        <w:t xml:space="preserve">  Set the pH cube to pH mode. Plug the pH sensor and the temperature sensor into their sockets. Remove the cap from the pH probe.</w:t>
+      </w:r>
+    </w:p>
+    <w:p>
+      <w:pPr>
+        <w:ind w:left="280"/>
+        <w:spacing w:after="50" w:before="0" w:line="245"/>
+      </w:pPr>
+      <w:r>
+        <w:rPr>
+          <w:rFonts w:ascii="Calibri" w:cs="Calibri" w:eastAsia="Calibri" w:hAnsi="Calibri"/>
+          <w:b/>
+          <w:bCs/>
+          <w:sz w:val="17"/>
+          <w:szCs w:val="17"/>
+        </w:rPr>
+        <w:t xml:space="preserve">19.</w:t>
+      </w:r>
+      <w:r>
+        <w:rPr>
+          <w:rFonts w:ascii="Calibri" w:cs="Calibri" w:eastAsia="Calibri" w:hAnsi="Calibri"/>
+          <w:sz w:val="17"/>
+          <w:szCs w:val="17"/>
+        </w:rPr>
+        <w:t xml:space="preserve">  Rinse the probe with clean water and dry it.</w:t>
+      </w:r>
+    </w:p>
+    <w:p>
+      <w:pPr>
+        <w:ind w:left="280"/>
+        <w:spacing w:after="50" w:before="0" w:line="245"/>
+      </w:pPr>
+      <w:r>
+        <w:rPr>
+          <w:rFonts w:ascii="Calibri" w:cs="Calibri" w:eastAsia="Calibri" w:hAnsi="Calibri"/>
+          <w:b/>
+          <w:bCs/>
+          <w:sz w:val="17"/>
+          <w:szCs w:val="17"/>
+        </w:rPr>
+        <w:t xml:space="preserve">20.</w:t>
+      </w:r>
+      <w:r>
+        <w:rPr>
+          <w:rFonts w:ascii="Calibri" w:cs="Calibri" w:eastAsia="Calibri" w:hAnsi="Calibri"/>
+          <w:sz w:val="17"/>
+          <w:szCs w:val="17"/>
+        </w:rPr>
+        <w:t xml:space="preserve">  Dip both sensors in the solution to be measured. Wait until the reading is stable, then record it.</w:t>
+      </w:r>
+    </w:p>
+    <w:p>
+      <w:pPr>
+        <w:ind w:left="280"/>
+        <w:spacing w:after="50" w:before="0" w:line="245"/>
+      </w:pPr>
+      <w:r>
+        <w:rPr>
+          <w:rFonts w:ascii="Calibri" w:cs="Calibri" w:eastAsia="Calibri" w:hAnsi="Calibri"/>
+          <w:b/>
+          <w:bCs/>
+          <w:sz w:val="17"/>
+          <w:szCs w:val="17"/>
+        </w:rPr>
+        <w:t xml:space="preserve">21.</w:t>
+      </w:r>
+      <w:r>
+        <w:rPr>
+          <w:rFonts w:ascii="Calibri" w:cs="Calibri" w:eastAsia="Calibri" w:hAnsi="Calibri"/>
+          <w:sz w:val="17"/>
+          <w:szCs w:val="17"/>
+        </w:rPr>
+        <w:t xml:space="preserve">  Clean-up: rinse the probe with clean water and keep it in water so it stays wet. Pour the sample into the hazardous (B3) waste jerrycan according to the sample classification. [CONFIRM] B3 waste is the Martabe hazardous waste classification; use this site's waste stream, and cyanide-bearing samples go to the cyanide stream (Section 7).</w:t>
+      </w:r>
+    </w:p>
+    <w:p>
+      <w:pPr>
         <w:pStyle w:val="Heading1"/>
         <w:spacing w:after="120" w:before="260"/>
       </w:pPr>
@@ -2607,6 +2864,24 @@
           <w:szCs w:val="17"/>
         </w:rPr>
         <w:t xml:space="preserve">Martabe work instruction 'Operate DO Meter Portable' DOC-3-MET-PRS-WIN-00055-IE v1.0 (issued 25/12/2024; reference SOPs DOC-2-MET-PRM-SOP-00037-IE and DOC-2-MET-MEL-SOP-00087-IE) - Part B source</w:t>
+      </w:r>
+    </w:p>
+    <w:p>
+      <w:pPr>
+        <w:pStyle w:val="ListParagraph"/>
+        <w:numPr>
+          <w:ilvl w:val="0"/>
+          <w:numId w:val="1"/>
+        </w:numPr>
+        <w:spacing w:after="60" w:line="245"/>
+      </w:pPr>
+      <w:r>
+        <w:rPr>
+          <w:rFonts w:ascii="Calibri" w:cs="Calibri" w:eastAsia="Calibri" w:hAnsi="Calibri"/>
+          <w:sz w:val="17"/>
+          <w:szCs w:val="17"/>
+        </w:rPr>
+        <w:t xml:space="preserve">Martabe work instruction 'Operating pH Cube Meter' DOC-3-MET-PMC-WIN-00089-IE v1.0 (issued 25/12/2024) - Part C source</w:t>
       </w:r>
     </w:p>
     <w:sectPr>

</xml_diff>